<commit_message>
fix: correct date formatting in ordonnance template
</commit_message>
<xml_diff>
--- a/src/templates/type-ordonance/ORDO_Pompe_seule.docx
+++ b/src/templates/type-ordonance/ORDO_Pompe_seule.docx
@@ -786,6 +786,12 @@
           <w:sz w:val="24"/>
         </w:rPr>
       </w:pPr>
+      <w:r>
+        <w:rPr>
+          <w:sz w:val="24"/>
+        </w:rPr>
+        <w:t>bzbszhbhbdhbzdhb</w:t>
+      </w:r>
     </w:p>
     <w:p>
       <w:pPr>
@@ -835,7 +841,7 @@
           <w:bCs/>
           <w:sz w:val="24"/>
         </w:rPr>
-        <w:t xml:space="preserve">lp_pompe </w:t>
+        <w:t>lp_pompe</w:t>
       </w:r>
       <w:r>
         <w:rPr>
@@ -2626,6 +2632,7 @@
   <w:style w:type="character" w:default="1" w:styleId="Policepardfaut">
     <w:name w:val="Default Paragraph Font"/>
     <w:uiPriority w:val="1"/>
+    <w:semiHidden/>
     <w:unhideWhenUsed/>
   </w:style>
   <w:style w:type="table" w:default="1" w:styleId="TableauNormal">

</xml_diff>